<commit_message>
Update journal to Blockchain: Research and Applications and remove Implementation from title
Co-authored-by: Muntasir-Mamun7 <138435835+Muntasir-Mamun7@users.noreply.github.com>
</commit_message>
<xml_diff>
--- a/elsarticle-template-num.docx
+++ b/elsarticle-template-num.docx
@@ -48,12 +48,8 @@
       <w:r>
         <w:t xml:space="preserve"> </w:t>
       </w:r>
-      <w:r>
-        <w:t xml:space="preserve">Implementation</w:t>
-      </w:r>
-      <w:r>
-        <w:t xml:space="preserve"> </w:t>
-      </w:r>
+      <w:r/>
+      <w:r/>
       <w:r>
         <w:t xml:space="preserve">based</w:t>
       </w:r>

</xml_diff>